<commit_message>
p03: tambah logo di sampul laporan
</commit_message>
<xml_diff>
--- a/laporan/p03_laporan_25430029.docx
+++ b/laporan/p03_laporan_25430029.docx
@@ -82,6 +82,53 @@
           <w:szCs w:val="24"/>
         </w:rPr>
         <w:t xml:space="preserve">Studi Kasus: Koperasi Mahasiswa Sejahtera (Kopma)</w:t>
+      </w:r>
+    </w:p>
+    <w:p>
+      <w:pPr>
+        <w:spacing w:after="360" w:before="360"/>
+        <w:jc w:val="center"/>
+      </w:pPr>
+      <w:r>
+        <w:rPr>
+          <w:rFonts w:ascii="Times New Roman" w:cs="Times New Roman" w:eastAsia="Times New Roman" w:hAnsi="Times New Roman"/>
+          <w:b w:val="false"/>
+          <w:bCs w:val="false"/>
+          <w:sz w:val="24"/>
+          <w:szCs w:val="24"/>
+        </w:rPr>
+        <w:drawing>
+          <wp:inline xmlns:a="http://schemas.openxmlformats.org/drawingml/2006/main" xmlns:pic="http://schemas.openxmlformats.org/drawingml/2006/picture">
+            <wp:extent cx="1440000" cy="1433600"/>
+            <wp:docPr id="4" name="Picture 4"/>
+            <wp:cNvGraphicFramePr>
+              <a:graphicFrameLocks noChangeAspect="1"/>
+            </wp:cNvGraphicFramePr>
+            <a:graphic>
+              <a:graphicData uri="http://schemas.openxmlformats.org/drawingml/2006/picture">
+                <pic:pic>
+                  <pic:nvPicPr>
+                    <pic:cNvPr id="0" name="1791891799400_image.png"/>
+                    <pic:cNvPicPr/>
+                  </pic:nvPicPr>
+                  <pic:blipFill>
+                    <a:blip r:embed="rId24"/>
+                    <a:stretch>
+                      <a:fillRect/>
+                    </a:stretch>
+                  </pic:blipFill>
+                  <pic:spPr>
+                    <a:xfrm>
+                      <a:off x="0" y="0"/>
+                      <a:ext cx="1440000" cy="1433600"/>
+                    </a:xfrm>
+                    <a:prstGeom prst="rect"/>
+                  </pic:spPr>
+                </pic:pic>
+              </a:graphicData>
+            </a:graphic>
+          </wp:inline>
+        </w:drawing>
       </w:r>
     </w:p>
     <w:tbl>

</xml_diff>